<commit_message>
did all data and unit of analysis section. Started with descriptive statistics
</commit_message>
<xml_diff>
--- a/literature/literature_review.docx
+++ b/literature/literature_review.docx
@@ -5,6 +5,7 @@
     <w:p>
       <w:pPr>
         <w:rPr>
+          <w:color w:val="000000" w:themeColor="text1"/>
           <w:lang w:val="es-ES_tradnl"/>
         </w:rPr>
       </w:pPr>
@@ -12,6 +13,7 @@
     <w:p>
       <w:pPr>
         <w:rPr>
+          <w:color w:val="000000" w:themeColor="text1"/>
           <w:lang w:val="es-ES_tradnl"/>
         </w:rPr>
       </w:pPr>
@@ -24,24 +26,48 @@
         <w:tblLook w:val="04A0" w:firstRow="1" w:lastRow="0" w:firstColumn="1" w:lastColumn="0" w:noHBand="0" w:noVBand="1"/>
       </w:tblPr>
       <w:tblGrid>
-        <w:gridCol w:w="3193"/>
-        <w:gridCol w:w="1060"/>
-        <w:gridCol w:w="5954"/>
-        <w:gridCol w:w="4394"/>
+        <w:gridCol w:w="658"/>
+        <w:gridCol w:w="4777"/>
+        <w:gridCol w:w="4171"/>
+        <w:gridCol w:w="4995"/>
       </w:tblGrid>
       <w:tr>
         <w:tc>
           <w:tcPr>
-            <w:tcW w:w="3193" w:type="dxa"/>
-          </w:tcPr>
-          <w:p>
-            <w:pPr>
-              <w:rPr>
-                <w:lang w:val="es-ES_tradnl"/>
-              </w:rPr>
-            </w:pPr>
-            <w:r>
-              <w:rPr>
+            <w:tcW w:w="658" w:type="dxa"/>
+          </w:tcPr>
+          <w:p>
+            <w:pPr>
+              <w:rPr>
+                <w:color w:val="000000" w:themeColor="text1"/>
+                <w:lang w:val="es-ES_tradnl"/>
+              </w:rPr>
+            </w:pPr>
+            <w:proofErr w:type="spellStart"/>
+            <w:r>
+              <w:rPr>
+                <w:color w:val="000000" w:themeColor="text1"/>
+                <w:lang w:val="es-ES_tradnl"/>
+              </w:rPr>
+              <w:t>pp</w:t>
+            </w:r>
+            <w:proofErr w:type="spellEnd"/>
+          </w:p>
+        </w:tc>
+        <w:tc>
+          <w:tcPr>
+            <w:tcW w:w="4777" w:type="dxa"/>
+          </w:tcPr>
+          <w:p>
+            <w:pPr>
+              <w:rPr>
+                <w:color w:val="000000" w:themeColor="text1"/>
+                <w:lang w:val="es-ES_tradnl"/>
+              </w:rPr>
+            </w:pPr>
+            <w:r>
+              <w:rPr>
+                <w:color w:val="000000" w:themeColor="text1"/>
                 <w:lang w:val="es-ES_tradnl"/>
               </w:rPr>
               <w:t xml:space="preserve">Titulo </w:t>
@@ -50,57 +76,41 @@
         </w:tc>
         <w:tc>
           <w:tcPr>
-            <w:tcW w:w="1060" w:type="dxa"/>
-          </w:tcPr>
-          <w:p>
-            <w:pPr>
-              <w:rPr>
-                <w:lang w:val="es-ES_tradnl"/>
-              </w:rPr>
-            </w:pPr>
-            <w:proofErr w:type="spellStart"/>
-            <w:r>
-              <w:rPr>
-                <w:lang w:val="es-ES_tradnl"/>
-              </w:rPr>
-              <w:t>pg</w:t>
-            </w:r>
-            <w:proofErr w:type="spellEnd"/>
-          </w:p>
-        </w:tc>
-        <w:tc>
-          <w:tcPr>
-            <w:tcW w:w="5954" w:type="dxa"/>
-          </w:tcPr>
-          <w:p>
-            <w:pPr>
-              <w:rPr>
-                <w:lang w:val="es-ES_tradnl"/>
-              </w:rPr>
-            </w:pPr>
-            <w:r>
-              <w:rPr>
-                <w:lang w:val="es-ES_tradnl"/>
-              </w:rPr>
-              <w:t>cita</w:t>
-            </w:r>
-          </w:p>
-        </w:tc>
-        <w:tc>
-          <w:tcPr>
-            <w:tcW w:w="4394" w:type="dxa"/>
-          </w:tcPr>
-          <w:p>
-            <w:pPr>
-              <w:rPr>
-                <w:lang w:val="es-ES_tradnl"/>
-              </w:rPr>
-            </w:pPr>
-            <w:r>
-              <w:rPr>
-                <w:lang w:val="es-ES_tradnl"/>
-              </w:rPr>
-              <w:t>comentario</w:t>
+            <w:tcW w:w="4171" w:type="dxa"/>
+          </w:tcPr>
+          <w:p>
+            <w:pPr>
+              <w:rPr>
+                <w:color w:val="000000" w:themeColor="text1"/>
+                <w:lang w:val="es-ES_tradnl"/>
+              </w:rPr>
+            </w:pPr>
+            <w:r>
+              <w:rPr>
+                <w:color w:val="000000" w:themeColor="text1"/>
+                <w:lang w:val="es-ES_tradnl"/>
+              </w:rPr>
+              <w:t>Resumen</w:t>
+            </w:r>
+          </w:p>
+        </w:tc>
+        <w:tc>
+          <w:tcPr>
+            <w:tcW w:w="4995" w:type="dxa"/>
+          </w:tcPr>
+          <w:p>
+            <w:pPr>
+              <w:rPr>
+                <w:color w:val="000000" w:themeColor="text1"/>
+                <w:lang w:val="es-ES_tradnl"/>
+              </w:rPr>
+            </w:pPr>
+            <w:r>
+              <w:rPr>
+                <w:color w:val="000000" w:themeColor="text1"/>
+                <w:lang w:val="es-ES_tradnl"/>
+              </w:rPr>
+              <w:t>Citas importantes</w:t>
             </w:r>
           </w:p>
         </w:tc>
@@ -108,13 +118,15 @@
       <w:tr>
         <w:tc>
           <w:tcPr>
-            <w:tcW w:w="3193" w:type="dxa"/>
-          </w:tcPr>
-          <w:p>
-            <w:pPr>
-              <w:rPr>
-                <w:i/>
-                <w:iCs/>
+            <w:tcW w:w="658" w:type="dxa"/>
+          </w:tcPr>
+          <w:p>
+            <w:pPr>
+              <w:rPr>
+                <w:i/>
+                <w:iCs/>
+                <w:strike/>
+                <w:color w:val="000000" w:themeColor="text1"/>
                 <w:lang w:val="es-ES"/>
               </w:rPr>
             </w:pPr>
@@ -122,24 +134,36 @@
               <w:rPr>
                 <w:i/>
                 <w:iCs/>
+                <w:strike/>
+                <w:color w:val="000000" w:themeColor="text1"/>
                 <w:lang w:val="es-ES"/>
               </w:rPr>
-              <w:t xml:space="preserve">1 </w:t>
-            </w:r>
-            <w:r>
-              <w:rPr>
-                <w:i/>
-                <w:iCs/>
+              <w:t>1</w:t>
+            </w:r>
+          </w:p>
+          <w:p>
+            <w:pPr>
+              <w:rPr>
+                <w:i/>
+                <w:iCs/>
+                <w:strike/>
+                <w:color w:val="000000" w:themeColor="text1"/>
                 <w:lang w:val="es-ES"/>
               </w:rPr>
-              <w:t>ANÁLISIS EMPÍRICO DE LA RELACIÓN</w:t>
-            </w:r>
-          </w:p>
-          <w:p>
-            <w:pPr>
-              <w:rPr>
-                <w:i/>
-                <w:iCs/>
+            </w:pPr>
+          </w:p>
+        </w:tc>
+        <w:tc>
+          <w:tcPr>
+            <w:tcW w:w="4777" w:type="dxa"/>
+          </w:tcPr>
+          <w:p>
+            <w:pPr>
+              <w:rPr>
+                <w:i/>
+                <w:iCs/>
+                <w:strike/>
+                <w:color w:val="000000" w:themeColor="text1"/>
                 <w:lang w:val="es-ES"/>
               </w:rPr>
             </w:pPr>
@@ -147,16 +171,20 @@
               <w:rPr>
                 <w:i/>
                 <w:iCs/>
+                <w:strike/>
+                <w:color w:val="000000" w:themeColor="text1"/>
                 <w:lang w:val="es-ES"/>
               </w:rPr>
-              <w:t>ENTRE LA ACTIVIDAD ECONÓMICA Y</w:t>
-            </w:r>
-          </w:p>
-          <w:p>
-            <w:pPr>
-              <w:rPr>
-                <w:i/>
-                <w:iCs/>
+              <w:t>Análisis empírico de la relación</w:t>
+            </w:r>
+          </w:p>
+          <w:p>
+            <w:pPr>
+              <w:rPr>
+                <w:i/>
+                <w:iCs/>
+                <w:strike/>
+                <w:color w:val="000000" w:themeColor="text1"/>
                 <w:lang w:val="es-ES"/>
               </w:rPr>
             </w:pPr>
@@ -164,14 +192,20 @@
               <w:rPr>
                 <w:i/>
                 <w:iCs/>
+                <w:strike/>
+                <w:color w:val="000000" w:themeColor="text1"/>
                 <w:lang w:val="es-ES"/>
               </w:rPr>
-              <w:t>LA VIOLENCIA HOMICIDA</w:t>
-            </w:r>
-          </w:p>
-          <w:p>
-            <w:pPr>
-              <w:rPr>
+              <w:t>entre la actividad económica y</w:t>
+            </w:r>
+          </w:p>
+          <w:p>
+            <w:pPr>
+              <w:rPr>
+                <w:i/>
+                <w:iCs/>
+                <w:strike/>
+                <w:color w:val="000000" w:themeColor="text1"/>
                 <w:lang w:val="es-ES"/>
               </w:rPr>
             </w:pPr>
@@ -179,113 +213,193 @@
               <w:rPr>
                 <w:i/>
                 <w:iCs/>
+                <w:strike/>
+                <w:color w:val="000000" w:themeColor="text1"/>
                 <w:lang w:val="es-ES"/>
               </w:rPr>
-              <w:t>EN COLOMBIA</w:t>
-            </w:r>
-          </w:p>
-        </w:tc>
-        <w:tc>
-          <w:tcPr>
-            <w:tcW w:w="1060" w:type="dxa"/>
-          </w:tcPr>
-          <w:p>
-            <w:pPr>
-              <w:rPr>
-                <w:lang w:val="es-ES_tradnl"/>
-              </w:rPr>
-            </w:pPr>
-          </w:p>
-        </w:tc>
-        <w:tc>
-          <w:tcPr>
-            <w:tcW w:w="5954" w:type="dxa"/>
-          </w:tcPr>
-          <w:p>
-            <w:pPr>
-              <w:rPr>
-                <w:lang w:val="es-ES_tradnl"/>
-              </w:rPr>
-            </w:pPr>
-          </w:p>
-        </w:tc>
-        <w:tc>
-          <w:tcPr>
-            <w:tcW w:w="4394" w:type="dxa"/>
-          </w:tcPr>
-          <w:p>
-            <w:pPr>
-              <w:rPr>
-                <w:lang w:val="es-ES_tradnl"/>
-              </w:rPr>
-            </w:pPr>
-            <w:r>
-              <w:rPr>
-                <w:lang w:val="es-ES_tradnl"/>
-              </w:rPr>
-              <w:t xml:space="preserve">Análisis entre </w:t>
+              <w:t>la violencia homicida</w:t>
+            </w:r>
+          </w:p>
+          <w:p>
+            <w:pPr>
+              <w:rPr>
+                <w:strike/>
+                <w:color w:val="000000" w:themeColor="text1"/>
+                <w:lang w:val="es-ES"/>
+              </w:rPr>
+            </w:pPr>
+            <w:r>
+              <w:rPr>
+                <w:i/>
+                <w:iCs/>
+                <w:strike/>
+                <w:color w:val="000000" w:themeColor="text1"/>
+                <w:lang w:val="es-ES"/>
+              </w:rPr>
+              <w:t xml:space="preserve">en </w:t>
             </w:r>
             <w:proofErr w:type="spellStart"/>
             <w:r>
               <w:rPr>
-                <w:lang w:val="es-ES_tradnl"/>
-              </w:rPr>
-              <w:t>pib</w:t>
+                <w:i/>
+                <w:iCs/>
+                <w:strike/>
+                <w:color w:val="000000" w:themeColor="text1"/>
+                <w:lang w:val="es-ES"/>
+              </w:rPr>
+              <w:t>colombia</w:t>
             </w:r>
             <w:proofErr w:type="spellEnd"/>
-            <w:r>
-              <w:rPr>
-                <w:lang w:val="es-ES_tradnl"/>
-              </w:rPr>
-              <w:t xml:space="preserve"> y violencia homicida</w:t>
-            </w:r>
+          </w:p>
+        </w:tc>
+        <w:tc>
+          <w:tcPr>
+            <w:tcW w:w="4171" w:type="dxa"/>
+          </w:tcPr>
+          <w:p>
+            <w:pPr>
+              <w:rPr>
+                <w:color w:val="000000" w:themeColor="text1"/>
+                <w:lang w:val="es-ES_tradnl"/>
+              </w:rPr>
+            </w:pPr>
+          </w:p>
+        </w:tc>
+        <w:tc>
+          <w:tcPr>
+            <w:tcW w:w="4995" w:type="dxa"/>
+          </w:tcPr>
+          <w:p>
+            <w:pPr>
+              <w:rPr>
+                <w:color w:val="000000" w:themeColor="text1"/>
+                <w:lang w:val="es-ES_tradnl"/>
+              </w:rPr>
+            </w:pPr>
           </w:p>
         </w:tc>
       </w:tr>
       <w:tr>
         <w:tc>
           <w:tcPr>
-            <w:tcW w:w="3193" w:type="dxa"/>
-          </w:tcPr>
-          <w:p>
-            <w:pPr>
-              <w:rPr>
-                <w:lang w:val="es-ES_tradnl"/>
-              </w:rPr>
-            </w:pPr>
-          </w:p>
-        </w:tc>
-        <w:tc>
-          <w:tcPr>
-            <w:tcW w:w="1060" w:type="dxa"/>
-          </w:tcPr>
-          <w:p>
-            <w:pPr>
-              <w:rPr>
-                <w:lang w:val="es-ES_tradnl"/>
-              </w:rPr>
-            </w:pPr>
-          </w:p>
-        </w:tc>
-        <w:tc>
-          <w:tcPr>
-            <w:tcW w:w="5954" w:type="dxa"/>
-          </w:tcPr>
-          <w:p>
-            <w:pPr>
-              <w:rPr>
-                <w:lang w:val="es-ES_tradnl"/>
-              </w:rPr>
-            </w:pPr>
-          </w:p>
-        </w:tc>
-        <w:tc>
-          <w:tcPr>
-            <w:tcW w:w="4394" w:type="dxa"/>
-          </w:tcPr>
-          <w:p>
-            <w:pPr>
-              <w:rPr>
+            <w:tcW w:w="658" w:type="dxa"/>
+          </w:tcPr>
+          <w:p>
+            <w:pPr>
+              <w:rPr>
+                <w:color w:val="000000" w:themeColor="text1"/>
+                <w:lang w:val="es-ES_tradnl"/>
+              </w:rPr>
+            </w:pPr>
+            <w:r>
+              <w:rPr>
+                <w:color w:val="000000" w:themeColor="text1"/>
+                <w:lang w:val="es-ES_tradnl"/>
+              </w:rPr>
+              <w:t>2</w:t>
+            </w:r>
+          </w:p>
+        </w:tc>
+        <w:tc>
+          <w:tcPr>
+            <w:tcW w:w="4777" w:type="dxa"/>
+          </w:tcPr>
+          <w:p>
+            <w:pPr>
+              <w:rPr>
+                <w:i/>
+                <w:iCs/>
+                <w:color w:val="000000" w:themeColor="text1"/>
+                <w:lang w:val="en-US"/>
+              </w:rPr>
+            </w:pPr>
+            <w:r>
+              <w:rPr>
+                <w:i/>
+                <w:iCs/>
+                <w:color w:val="000000" w:themeColor="text1"/>
+                <w:lang w:val="en-US"/>
+              </w:rPr>
+              <w:t>Are Dollar Stores</w:t>
+            </w:r>
+          </w:p>
+          <w:p>
+            <w:pPr>
+              <w:rPr>
+                <w:i/>
+                <w:iCs/>
+                <w:color w:val="000000" w:themeColor="text1"/>
+                <w:lang w:val="en-US"/>
+              </w:rPr>
+            </w:pPr>
+            <w:r>
+              <w:rPr>
+                <w:i/>
+                <w:iCs/>
+                <w:color w:val="000000" w:themeColor="text1"/>
+                <w:lang w:val="en-US"/>
+              </w:rPr>
+              <w:t>Magnets for Violent</w:t>
+            </w:r>
+          </w:p>
+          <w:p>
+            <w:pPr>
+              <w:rPr>
+                <w:i/>
+                <w:iCs/>
+                <w:color w:val="000000" w:themeColor="text1"/>
+                <w:lang w:val="en-US"/>
+              </w:rPr>
+            </w:pPr>
+            <w:r>
+              <w:rPr>
+                <w:i/>
+                <w:iCs/>
+                <w:color w:val="000000" w:themeColor="text1"/>
+                <w:lang w:val="en-US"/>
+              </w:rPr>
+              <w:t>Crime? Evidence from</w:t>
+            </w:r>
+          </w:p>
+          <w:p>
+            <w:pPr>
+              <w:rPr>
+                <w:color w:val="000000" w:themeColor="text1"/>
+                <w:lang w:val="es-ES_tradnl"/>
+              </w:rPr>
+            </w:pPr>
+            <w:r>
+              <w:rPr>
+                <w:i/>
+                <w:iCs/>
+                <w:color w:val="000000" w:themeColor="text1"/>
+                <w:lang w:val="en-US"/>
+              </w:rPr>
+              <w:t>Chicago</w:t>
+            </w:r>
+          </w:p>
+        </w:tc>
+        <w:tc>
+          <w:tcPr>
+            <w:tcW w:w="4171" w:type="dxa"/>
+          </w:tcPr>
+          <w:p>
+            <w:pPr>
+              <w:rPr>
+                <w:color w:val="000000" w:themeColor="text1"/>
+                <w:lang w:val="es-ES_tradnl"/>
+              </w:rPr>
+            </w:pPr>
+          </w:p>
+        </w:tc>
+        <w:tc>
+          <w:tcPr>
+            <w:tcW w:w="4995" w:type="dxa"/>
+          </w:tcPr>
+          <w:p>
+            <w:pPr>
+              <w:rPr>
+                <w:color w:val="000000" w:themeColor="text1"/>
                 <w:lang w:val="es-ES_tradnl"/>
               </w:rPr>
             </w:pPr>
@@ -295,48 +409,71 @@
       <w:tr>
         <w:tc>
           <w:tcPr>
-            <w:tcW w:w="3193" w:type="dxa"/>
-          </w:tcPr>
-          <w:p>
-            <w:pPr>
-              <w:rPr>
-                <w:lang w:val="es-ES_tradnl"/>
-              </w:rPr>
-            </w:pPr>
-          </w:p>
-        </w:tc>
-        <w:tc>
-          <w:tcPr>
-            <w:tcW w:w="1060" w:type="dxa"/>
-          </w:tcPr>
-          <w:p>
-            <w:pPr>
-              <w:rPr>
-                <w:lang w:val="es-ES_tradnl"/>
-              </w:rPr>
-            </w:pPr>
-          </w:p>
-        </w:tc>
-        <w:tc>
-          <w:tcPr>
-            <w:tcW w:w="5954" w:type="dxa"/>
-          </w:tcPr>
-          <w:p>
-            <w:pPr>
-              <w:rPr>
-                <w:lang w:val="es-ES_tradnl"/>
-              </w:rPr>
-            </w:pPr>
-          </w:p>
-        </w:tc>
-        <w:tc>
-          <w:tcPr>
-            <w:tcW w:w="4394" w:type="dxa"/>
-          </w:tcPr>
-          <w:p>
-            <w:pPr>
-              <w:rPr>
-                <w:lang w:val="es-ES_tradnl"/>
+            <w:tcW w:w="658" w:type="dxa"/>
+          </w:tcPr>
+          <w:p>
+            <w:pPr>
+              <w:rPr>
+                <w:color w:val="000000" w:themeColor="text1"/>
+                <w:highlight w:val="green"/>
+                <w:lang w:val="es-ES_tradnl"/>
+              </w:rPr>
+            </w:pPr>
+            <w:r>
+              <w:rPr>
+                <w:color w:val="000000" w:themeColor="text1"/>
+                <w:highlight w:val="green"/>
+                <w:lang w:val="es-ES_tradnl"/>
+              </w:rPr>
+              <w:t>3</w:t>
+            </w:r>
+          </w:p>
+        </w:tc>
+        <w:tc>
+          <w:tcPr>
+            <w:tcW w:w="4777" w:type="dxa"/>
+          </w:tcPr>
+          <w:p>
+            <w:pPr>
+              <w:rPr>
+                <w:color w:val="000000" w:themeColor="text1"/>
+                <w:highlight w:val="green"/>
+                <w:lang w:val="en-US"/>
+              </w:rPr>
+            </w:pPr>
+            <w:r>
+              <w:rPr>
+                <w:color w:val="000000" w:themeColor="text1"/>
+                <w:highlight w:val="green"/>
+                <w:lang w:val="en-US"/>
+              </w:rPr>
+              <w:t>Multistate Study of Convenience Store Robberies</w:t>
+            </w:r>
+          </w:p>
+        </w:tc>
+        <w:tc>
+          <w:tcPr>
+            <w:tcW w:w="4171" w:type="dxa"/>
+          </w:tcPr>
+          <w:p>
+            <w:pPr>
+              <w:rPr>
+                <w:color w:val="000000" w:themeColor="text1"/>
+                <w:highlight w:val="green"/>
+                <w:lang w:val="en-US"/>
+              </w:rPr>
+            </w:pPr>
+          </w:p>
+        </w:tc>
+        <w:tc>
+          <w:tcPr>
+            <w:tcW w:w="4995" w:type="dxa"/>
+          </w:tcPr>
+          <w:p>
+            <w:pPr>
+              <w:rPr>
+                <w:color w:val="000000" w:themeColor="text1"/>
+                <w:lang w:val="en-US"/>
               </w:rPr>
             </w:pPr>
           </w:p>
@@ -345,48 +482,1253 @@
       <w:tr>
         <w:tc>
           <w:tcPr>
-            <w:tcW w:w="3193" w:type="dxa"/>
-          </w:tcPr>
-          <w:p>
-            <w:pPr>
-              <w:rPr>
-                <w:lang w:val="es-ES_tradnl"/>
-              </w:rPr>
-            </w:pPr>
-          </w:p>
-        </w:tc>
-        <w:tc>
-          <w:tcPr>
-            <w:tcW w:w="1060" w:type="dxa"/>
-          </w:tcPr>
-          <w:p>
-            <w:pPr>
-              <w:rPr>
-                <w:lang w:val="es-ES_tradnl"/>
-              </w:rPr>
-            </w:pPr>
-          </w:p>
-        </w:tc>
-        <w:tc>
-          <w:tcPr>
-            <w:tcW w:w="5954" w:type="dxa"/>
-          </w:tcPr>
-          <w:p>
-            <w:pPr>
-              <w:rPr>
-                <w:lang w:val="es-ES_tradnl"/>
-              </w:rPr>
-            </w:pPr>
-          </w:p>
-        </w:tc>
-        <w:tc>
-          <w:tcPr>
-            <w:tcW w:w="4394" w:type="dxa"/>
-          </w:tcPr>
-          <w:p>
-            <w:pPr>
-              <w:rPr>
-                <w:lang w:val="es-ES_tradnl"/>
+            <w:tcW w:w="658" w:type="dxa"/>
+          </w:tcPr>
+          <w:p>
+            <w:pPr>
+              <w:rPr>
+                <w:color w:val="000000" w:themeColor="text1"/>
+                <w:highlight w:val="green"/>
+                <w:lang w:val="es-ES_tradnl"/>
+              </w:rPr>
+            </w:pPr>
+            <w:r>
+              <w:rPr>
+                <w:color w:val="000000" w:themeColor="text1"/>
+                <w:highlight w:val="green"/>
+                <w:lang w:val="es-ES_tradnl"/>
+              </w:rPr>
+              <w:t>4</w:t>
+            </w:r>
+          </w:p>
+        </w:tc>
+        <w:tc>
+          <w:tcPr>
+            <w:tcW w:w="4777" w:type="dxa"/>
+          </w:tcPr>
+          <w:p>
+            <w:pPr>
+              <w:rPr>
+                <w:color w:val="000000" w:themeColor="text1"/>
+                <w:highlight w:val="green"/>
+                <w:lang w:val="en-US"/>
+              </w:rPr>
+            </w:pPr>
+            <w:r>
+              <w:rPr>
+                <w:i/>
+                <w:iCs/>
+                <w:color w:val="000000" w:themeColor="text1"/>
+                <w:highlight w:val="green"/>
+                <w:lang w:val="en-US"/>
+              </w:rPr>
+              <w:t>The Pass-through of Retail Crime</w:t>
+            </w:r>
+            <w:r>
+              <w:rPr>
+                <w:rFonts w:ascii="Cambria Math" w:hAnsi="Cambria Math" w:cs="Cambria Math"/>
+                <w:i/>
+                <w:iCs/>
+                <w:color w:val="000000" w:themeColor="text1"/>
+                <w:highlight w:val="green"/>
+                <w:lang w:val="en-US"/>
+              </w:rPr>
+              <w:t>∗</w:t>
+            </w:r>
+          </w:p>
+        </w:tc>
+        <w:tc>
+          <w:tcPr>
+            <w:tcW w:w="4171" w:type="dxa"/>
+          </w:tcPr>
+          <w:p>
+            <w:pPr>
+              <w:rPr>
+                <w:color w:val="000000" w:themeColor="text1"/>
+                <w:highlight w:val="green"/>
+                <w:lang w:val="en-US"/>
+              </w:rPr>
+            </w:pPr>
+            <w:r>
+              <w:rPr>
+                <w:i/>
+                <w:iCs/>
+                <w:color w:val="000000" w:themeColor="text1"/>
+                <w:highlight w:val="green"/>
+                <w:lang w:val="en-US"/>
+              </w:rPr>
+              <w:t>This paper shows that retailers</w:t>
+            </w:r>
+            <w:r>
+              <w:rPr>
+                <w:i/>
+                <w:iCs/>
+                <w:color w:val="000000" w:themeColor="text1"/>
+                <w:highlight w:val="green"/>
+                <w:lang w:val="en-US"/>
+              </w:rPr>
+              <w:t xml:space="preserve"> </w:t>
+            </w:r>
+            <w:r>
+              <w:rPr>
+                <w:i/>
+                <w:iCs/>
+                <w:color w:val="000000" w:themeColor="text1"/>
+                <w:highlight w:val="green"/>
+                <w:lang w:val="en-US"/>
+              </w:rPr>
+              <w:t>increase prices in response to</w:t>
+            </w:r>
+            <w:r>
+              <w:rPr>
+                <w:i/>
+                <w:iCs/>
+                <w:color w:val="000000" w:themeColor="text1"/>
+                <w:highlight w:val="green"/>
+                <w:lang w:val="en-US"/>
+              </w:rPr>
+              <w:t xml:space="preserve"> </w:t>
+            </w:r>
+            <w:r>
+              <w:rPr>
+                <w:i/>
+                <w:iCs/>
+                <w:color w:val="000000" w:themeColor="text1"/>
+                <w:highlight w:val="green"/>
+                <w:lang w:val="en-US"/>
+              </w:rPr>
+              <w:t>organized retail crime.</w:t>
+            </w:r>
+          </w:p>
+        </w:tc>
+        <w:tc>
+          <w:tcPr>
+            <w:tcW w:w="4995" w:type="dxa"/>
+          </w:tcPr>
+          <w:p>
+            <w:pPr>
+              <w:rPr>
+                <w:color w:val="000000" w:themeColor="text1"/>
+                <w:lang w:val="en-US"/>
+              </w:rPr>
+            </w:pPr>
+          </w:p>
+        </w:tc>
+      </w:tr>
+      <w:tr>
+        <w:tc>
+          <w:tcPr>
+            <w:tcW w:w="658" w:type="dxa"/>
+          </w:tcPr>
+          <w:p>
+            <w:pPr>
+              <w:rPr>
+                <w:color w:val="000000" w:themeColor="text1"/>
+                <w:highlight w:val="green"/>
+                <w:lang w:val="es-ES_tradnl"/>
+              </w:rPr>
+            </w:pPr>
+            <w:r>
+              <w:rPr>
+                <w:color w:val="000000" w:themeColor="text1"/>
+                <w:highlight w:val="green"/>
+                <w:lang w:val="es-ES_tradnl"/>
+              </w:rPr>
+              <w:t>5</w:t>
+            </w:r>
+          </w:p>
+        </w:tc>
+        <w:tc>
+          <w:tcPr>
+            <w:tcW w:w="4777" w:type="dxa"/>
+          </w:tcPr>
+          <w:p>
+            <w:pPr>
+              <w:rPr>
+                <w:i/>
+                <w:iCs/>
+                <w:color w:val="000000" w:themeColor="text1"/>
+                <w:highlight w:val="green"/>
+                <w:lang w:val="en-US"/>
+              </w:rPr>
+            </w:pPr>
+            <w:r>
+              <w:rPr>
+                <w:i/>
+                <w:iCs/>
+                <w:color w:val="000000" w:themeColor="text1"/>
+                <w:highlight w:val="green"/>
+                <w:lang w:val="en-US"/>
+              </w:rPr>
+              <w:t>Fast Food Restaurants</w:t>
+            </w:r>
+            <w:r>
+              <w:rPr>
+                <w:i/>
+                <w:iCs/>
+                <w:color w:val="000000" w:themeColor="text1"/>
+                <w:highlight w:val="green"/>
+                <w:lang w:val="en-US"/>
+              </w:rPr>
+              <w:t xml:space="preserve"> </w:t>
+            </w:r>
+            <w:r>
+              <w:rPr>
+                <w:i/>
+                <w:iCs/>
+                <w:color w:val="000000" w:themeColor="text1"/>
+                <w:highlight w:val="green"/>
+                <w:lang w:val="en-US"/>
+              </w:rPr>
+              <w:t>and Convenience Stores:</w:t>
+            </w:r>
+            <w:r>
+              <w:rPr>
+                <w:i/>
+                <w:iCs/>
+                <w:color w:val="000000" w:themeColor="text1"/>
+                <w:highlight w:val="green"/>
+                <w:lang w:val="en-US"/>
+              </w:rPr>
+              <w:t xml:space="preserve"> </w:t>
+            </w:r>
+            <w:r>
+              <w:rPr>
+                <w:i/>
+                <w:iCs/>
+                <w:color w:val="000000" w:themeColor="text1"/>
+                <w:highlight w:val="green"/>
+                <w:lang w:val="en-US"/>
+              </w:rPr>
+              <w:t>Using Sales Volume to</w:t>
+            </w:r>
+            <w:r>
+              <w:rPr>
+                <w:i/>
+                <w:iCs/>
+                <w:color w:val="000000" w:themeColor="text1"/>
+                <w:highlight w:val="green"/>
+                <w:lang w:val="en-US"/>
+              </w:rPr>
+              <w:t xml:space="preserve"> </w:t>
+            </w:r>
+            <w:r>
+              <w:rPr>
+                <w:i/>
+                <w:iCs/>
+                <w:color w:val="000000" w:themeColor="text1"/>
+                <w:highlight w:val="green"/>
+                <w:lang w:val="en-US"/>
+              </w:rPr>
+              <w:t>Explain Crime Patterns</w:t>
+            </w:r>
+            <w:r>
+              <w:rPr>
+                <w:i/>
+                <w:iCs/>
+                <w:color w:val="000000" w:themeColor="text1"/>
+                <w:highlight w:val="green"/>
+                <w:lang w:val="en-US"/>
+              </w:rPr>
+              <w:t xml:space="preserve"> </w:t>
+            </w:r>
+            <w:r>
+              <w:rPr>
+                <w:i/>
+                <w:iCs/>
+                <w:color w:val="000000" w:themeColor="text1"/>
+                <w:highlight w:val="green"/>
+                <w:lang w:val="en-US"/>
+              </w:rPr>
+              <w:t>in Seattle</w:t>
+            </w:r>
+          </w:p>
+        </w:tc>
+        <w:tc>
+          <w:tcPr>
+            <w:tcW w:w="4171" w:type="dxa"/>
+          </w:tcPr>
+          <w:p>
+            <w:pPr>
+              <w:rPr>
+                <w:i/>
+                <w:iCs/>
+                <w:color w:val="000000" w:themeColor="text1"/>
+                <w:highlight w:val="green"/>
+                <w:lang w:val="en-US"/>
+              </w:rPr>
+            </w:pPr>
+            <w:r>
+              <w:rPr>
+                <w:i/>
+                <w:iCs/>
+                <w:color w:val="000000" w:themeColor="text1"/>
+                <w:highlight w:val="green"/>
+                <w:lang w:val="en-US"/>
+              </w:rPr>
+              <w:t>This study investigates how</w:t>
+            </w:r>
+            <w:r>
+              <w:rPr>
+                <w:i/>
+                <w:iCs/>
+                <w:color w:val="000000" w:themeColor="text1"/>
+                <w:highlight w:val="green"/>
+                <w:lang w:val="en-US"/>
+              </w:rPr>
+              <w:t xml:space="preserve"> </w:t>
+            </w:r>
+            <w:r>
+              <w:rPr>
+                <w:i/>
+                <w:iCs/>
+                <w:color w:val="000000" w:themeColor="text1"/>
+                <w:highlight w:val="green"/>
+                <w:lang w:val="en-US"/>
+              </w:rPr>
+              <w:t xml:space="preserve">convenience stores and </w:t>
+            </w:r>
+            <w:r>
+              <w:rPr>
+                <w:i/>
+                <w:iCs/>
+                <w:color w:val="000000" w:themeColor="text1"/>
+                <w:highlight w:val="green"/>
+                <w:lang w:val="en-US"/>
+              </w:rPr>
+              <w:t>fast-food</w:t>
+            </w:r>
+            <w:r>
+              <w:rPr>
+                <w:i/>
+                <w:iCs/>
+                <w:color w:val="000000" w:themeColor="text1"/>
+                <w:highlight w:val="green"/>
+                <w:lang w:val="en-US"/>
+              </w:rPr>
+              <w:t xml:space="preserve"> </w:t>
+            </w:r>
+            <w:r>
+              <w:rPr>
+                <w:i/>
+                <w:iCs/>
+                <w:color w:val="000000" w:themeColor="text1"/>
+                <w:highlight w:val="green"/>
+                <w:lang w:val="en-US"/>
+              </w:rPr>
+              <w:t>restaurants</w:t>
+            </w:r>
+            <w:r>
+              <w:rPr>
+                <w:i/>
+                <w:iCs/>
+                <w:color w:val="000000" w:themeColor="text1"/>
+                <w:highlight w:val="green"/>
+                <w:lang w:val="en-US"/>
+              </w:rPr>
+              <w:t xml:space="preserve"> </w:t>
+            </w:r>
+            <w:r>
+              <w:rPr>
+                <w:i/>
+                <w:iCs/>
+                <w:color w:val="000000" w:themeColor="text1"/>
+                <w:highlight w:val="green"/>
+                <w:lang w:val="en-US"/>
+              </w:rPr>
+              <w:t>influence crime patterns over time.</w:t>
+            </w:r>
+          </w:p>
+        </w:tc>
+        <w:tc>
+          <w:tcPr>
+            <w:tcW w:w="4995" w:type="dxa"/>
+          </w:tcPr>
+          <w:p>
+            <w:pPr>
+              <w:rPr>
+                <w:color w:val="000000" w:themeColor="text1"/>
+                <w:lang w:val="en-US"/>
+              </w:rPr>
+            </w:pPr>
+          </w:p>
+        </w:tc>
+      </w:tr>
+      <w:tr>
+        <w:tc>
+          <w:tcPr>
+            <w:tcW w:w="658" w:type="dxa"/>
+          </w:tcPr>
+          <w:p>
+            <w:pPr>
+              <w:rPr>
+                <w:color w:val="000000" w:themeColor="text1"/>
+                <w:lang w:val="es-ES_tradnl"/>
+              </w:rPr>
+            </w:pPr>
+            <w:r>
+              <w:rPr>
+                <w:color w:val="000000" w:themeColor="text1"/>
+                <w:lang w:val="es-ES_tradnl"/>
+              </w:rPr>
+              <w:t>6</w:t>
+            </w:r>
+          </w:p>
+        </w:tc>
+        <w:tc>
+          <w:tcPr>
+            <w:tcW w:w="4777" w:type="dxa"/>
+          </w:tcPr>
+          <w:p>
+            <w:pPr>
+              <w:rPr>
+                <w:color w:val="000000" w:themeColor="text1"/>
+                <w:lang w:val="en-US"/>
+              </w:rPr>
+            </w:pPr>
+            <w:r>
+              <w:rPr>
+                <w:color w:val="000000" w:themeColor="text1"/>
+                <w:lang w:val="en-US"/>
+              </w:rPr>
+              <w:t>“Not all convenience stores are equal”. An analysis of the criminogenic role of corner Stores in Newark, NJ</w:t>
+            </w:r>
+          </w:p>
+        </w:tc>
+        <w:tc>
+          <w:tcPr>
+            <w:tcW w:w="4171" w:type="dxa"/>
+          </w:tcPr>
+          <w:p>
+            <w:pPr>
+              <w:rPr>
+                <w:color w:val="000000" w:themeColor="text1"/>
+                <w:lang w:val="en-US"/>
+              </w:rPr>
+            </w:pPr>
+          </w:p>
+        </w:tc>
+        <w:tc>
+          <w:tcPr>
+            <w:tcW w:w="4995" w:type="dxa"/>
+          </w:tcPr>
+          <w:p>
+            <w:pPr>
+              <w:rPr>
+                <w:color w:val="000000" w:themeColor="text1"/>
+                <w:lang w:val="en-US"/>
+              </w:rPr>
+            </w:pPr>
+          </w:p>
+        </w:tc>
+      </w:tr>
+      <w:tr>
+        <w:tc>
+          <w:tcPr>
+            <w:tcW w:w="658" w:type="dxa"/>
+          </w:tcPr>
+          <w:p>
+            <w:pPr>
+              <w:rPr>
+                <w:color w:val="000000" w:themeColor="text1"/>
+                <w:highlight w:val="green"/>
+                <w:lang w:val="es-ES_tradnl"/>
+              </w:rPr>
+            </w:pPr>
+            <w:r>
+              <w:rPr>
+                <w:color w:val="000000" w:themeColor="text1"/>
+                <w:highlight w:val="green"/>
+                <w:lang w:val="es-ES_tradnl"/>
+              </w:rPr>
+              <w:t>7</w:t>
+            </w:r>
+          </w:p>
+        </w:tc>
+        <w:tc>
+          <w:tcPr>
+            <w:tcW w:w="4777" w:type="dxa"/>
+          </w:tcPr>
+          <w:p>
+            <w:pPr>
+              <w:rPr>
+                <w:i/>
+                <w:iCs/>
+                <w:color w:val="000000" w:themeColor="text1"/>
+                <w:highlight w:val="green"/>
+                <w:lang w:val="en-US"/>
+              </w:rPr>
+            </w:pPr>
+            <w:r>
+              <w:rPr>
+                <w:i/>
+                <w:iCs/>
+                <w:color w:val="000000" w:themeColor="text1"/>
+                <w:highlight w:val="green"/>
+                <w:lang w:val="en-US"/>
+              </w:rPr>
+              <w:t>Supermarket operating hours and</w:t>
+            </w:r>
+          </w:p>
+          <w:p>
+            <w:pPr>
+              <w:rPr>
+                <w:color w:val="000000" w:themeColor="text1"/>
+                <w:highlight w:val="green"/>
+                <w:lang w:val="en-US"/>
+              </w:rPr>
+            </w:pPr>
+            <w:r>
+              <w:rPr>
+                <w:i/>
+                <w:iCs/>
+                <w:color w:val="000000" w:themeColor="text1"/>
+                <w:highlight w:val="green"/>
+                <w:lang w:val="en-US"/>
+              </w:rPr>
+              <w:t>distance to crime</w:t>
+            </w:r>
+          </w:p>
+        </w:tc>
+        <w:tc>
+          <w:tcPr>
+            <w:tcW w:w="4171" w:type="dxa"/>
+          </w:tcPr>
+          <w:p>
+            <w:pPr>
+              <w:rPr>
+                <w:color w:val="000000" w:themeColor="text1"/>
+                <w:lang w:val="en-US"/>
+              </w:rPr>
+            </w:pPr>
+          </w:p>
+        </w:tc>
+        <w:tc>
+          <w:tcPr>
+            <w:tcW w:w="4995" w:type="dxa"/>
+          </w:tcPr>
+          <w:p>
+            <w:pPr>
+              <w:rPr>
+                <w:color w:val="000000" w:themeColor="text1"/>
+                <w:lang w:val="en-US"/>
+              </w:rPr>
+            </w:pPr>
+          </w:p>
+        </w:tc>
+      </w:tr>
+      <w:tr>
+        <w:tc>
+          <w:tcPr>
+            <w:tcW w:w="658" w:type="dxa"/>
+          </w:tcPr>
+          <w:p>
+            <w:pPr>
+              <w:rPr>
+                <w:color w:val="000000" w:themeColor="text1"/>
+                <w:lang w:val="es-ES_tradnl"/>
+              </w:rPr>
+            </w:pPr>
+            <w:r>
+              <w:rPr>
+                <w:color w:val="000000" w:themeColor="text1"/>
+                <w:lang w:val="es-ES_tradnl"/>
+              </w:rPr>
+              <w:t>8</w:t>
+            </w:r>
+          </w:p>
+        </w:tc>
+        <w:tc>
+          <w:tcPr>
+            <w:tcW w:w="4777" w:type="dxa"/>
+          </w:tcPr>
+          <w:p>
+            <w:pPr>
+              <w:rPr>
+                <w:color w:val="000000" w:themeColor="text1"/>
+                <w:lang w:val="en-US"/>
+              </w:rPr>
+            </w:pPr>
+            <w:r>
+              <w:rPr>
+                <w:i/>
+                <w:iCs/>
+                <w:color w:val="000000" w:themeColor="text1"/>
+                <w:lang w:val="en-US"/>
+              </w:rPr>
+              <w:t>Spatial, Temporal, and Explanatory Analyses of Urban Crime</w:t>
+            </w:r>
+          </w:p>
+        </w:tc>
+        <w:tc>
+          <w:tcPr>
+            <w:tcW w:w="4171" w:type="dxa"/>
+          </w:tcPr>
+          <w:p>
+            <w:pPr>
+              <w:rPr>
+                <w:color w:val="000000" w:themeColor="text1"/>
+                <w:lang w:val="en-US"/>
+              </w:rPr>
+            </w:pPr>
+          </w:p>
+        </w:tc>
+        <w:tc>
+          <w:tcPr>
+            <w:tcW w:w="4995" w:type="dxa"/>
+          </w:tcPr>
+          <w:p>
+            <w:pPr>
+              <w:rPr>
+                <w:color w:val="000000" w:themeColor="text1"/>
+                <w:lang w:val="en-US"/>
+              </w:rPr>
+            </w:pPr>
+          </w:p>
+        </w:tc>
+      </w:tr>
+      <w:tr>
+        <w:tc>
+          <w:tcPr>
+            <w:tcW w:w="658" w:type="dxa"/>
+          </w:tcPr>
+          <w:p>
+            <w:pPr>
+              <w:rPr>
+                <w:color w:val="000000" w:themeColor="text1"/>
+                <w:lang w:val="es-ES_tradnl"/>
+              </w:rPr>
+            </w:pPr>
+            <w:r>
+              <w:rPr>
+                <w:color w:val="000000" w:themeColor="text1"/>
+                <w:lang w:val="es-ES_tradnl"/>
+              </w:rPr>
+              <w:t>9</w:t>
+            </w:r>
+          </w:p>
+        </w:tc>
+        <w:tc>
+          <w:tcPr>
+            <w:tcW w:w="4777" w:type="dxa"/>
+          </w:tcPr>
+          <w:p>
+            <w:pPr>
+              <w:rPr>
+                <w:i/>
+                <w:iCs/>
+                <w:color w:val="000000" w:themeColor="text1"/>
+                <w:lang w:val="en-US"/>
+              </w:rPr>
+            </w:pPr>
+            <w:r>
+              <w:rPr>
+                <w:i/>
+                <w:iCs/>
+                <w:color w:val="000000" w:themeColor="text1"/>
+                <w:lang w:val="en-US"/>
+              </w:rPr>
+              <w:t>Frontiers in the economics of crime: lessons</w:t>
+            </w:r>
+          </w:p>
+          <w:p>
+            <w:pPr>
+              <w:rPr>
+                <w:color w:val="000000" w:themeColor="text1"/>
+                <w:lang w:val="en-US"/>
+              </w:rPr>
+            </w:pPr>
+            <w:r>
+              <w:rPr>
+                <w:i/>
+                <w:iCs/>
+                <w:color w:val="000000" w:themeColor="text1"/>
+                <w:lang w:val="en-US"/>
+              </w:rPr>
+              <w:t>for Latin America and the Caribbean</w:t>
+            </w:r>
+          </w:p>
+        </w:tc>
+        <w:tc>
+          <w:tcPr>
+            <w:tcW w:w="4171" w:type="dxa"/>
+          </w:tcPr>
+          <w:p>
+            <w:pPr>
+              <w:rPr>
+                <w:color w:val="000000" w:themeColor="text1"/>
+                <w:lang w:val="en-US"/>
+              </w:rPr>
+            </w:pPr>
+          </w:p>
+        </w:tc>
+        <w:tc>
+          <w:tcPr>
+            <w:tcW w:w="4995" w:type="dxa"/>
+          </w:tcPr>
+          <w:p>
+            <w:pPr>
+              <w:rPr>
+                <w:color w:val="000000" w:themeColor="text1"/>
+                <w:lang w:val="en-US"/>
+              </w:rPr>
+            </w:pPr>
+          </w:p>
+        </w:tc>
+      </w:tr>
+      <w:tr>
+        <w:tc>
+          <w:tcPr>
+            <w:tcW w:w="658" w:type="dxa"/>
+          </w:tcPr>
+          <w:p>
+            <w:pPr>
+              <w:rPr>
+                <w:color w:val="000000" w:themeColor="text1"/>
+                <w:lang w:val="es-ES_tradnl"/>
+              </w:rPr>
+            </w:pPr>
+            <w:r>
+              <w:rPr>
+                <w:color w:val="000000" w:themeColor="text1"/>
+                <w:lang w:val="es-ES_tradnl"/>
+              </w:rPr>
+              <w:t>10</w:t>
+            </w:r>
+          </w:p>
+        </w:tc>
+        <w:tc>
+          <w:tcPr>
+            <w:tcW w:w="4777" w:type="dxa"/>
+          </w:tcPr>
+          <w:p>
+            <w:pPr>
+              <w:rPr>
+                <w:color w:val="000000" w:themeColor="text1"/>
+                <w:lang w:val="en-US"/>
+              </w:rPr>
+            </w:pPr>
+          </w:p>
+          <w:p>
+            <w:pPr>
+              <w:rPr>
+                <w:color w:val="000000" w:themeColor="text1"/>
+                <w:lang w:val="en-US"/>
+              </w:rPr>
+            </w:pPr>
+            <w:r>
+              <w:rPr>
+                <w:color w:val="000000" w:themeColor="text1"/>
+                <w:lang w:val="en-US"/>
+              </w:rPr>
+              <w:lastRenderedPageBreak/>
+              <w:t xml:space="preserve"> No sales after midnight: evaluating the impact of a business curfew on drug-related crime in San Francisco’s tenderloin</w:t>
+            </w:r>
+          </w:p>
+        </w:tc>
+        <w:tc>
+          <w:tcPr>
+            <w:tcW w:w="4171" w:type="dxa"/>
+          </w:tcPr>
+          <w:p>
+            <w:pPr>
+              <w:rPr>
+                <w:color w:val="000000" w:themeColor="text1"/>
+                <w:lang w:val="en-US"/>
+              </w:rPr>
+            </w:pPr>
+          </w:p>
+        </w:tc>
+        <w:tc>
+          <w:tcPr>
+            <w:tcW w:w="4995" w:type="dxa"/>
+          </w:tcPr>
+          <w:p>
+            <w:pPr>
+              <w:rPr>
+                <w:color w:val="000000" w:themeColor="text1"/>
+                <w:lang w:val="en-US"/>
+              </w:rPr>
+            </w:pPr>
+          </w:p>
+        </w:tc>
+      </w:tr>
+      <w:tr>
+        <w:tc>
+          <w:tcPr>
+            <w:tcW w:w="658" w:type="dxa"/>
+          </w:tcPr>
+          <w:p>
+            <w:pPr>
+              <w:rPr>
+                <w:color w:val="000000" w:themeColor="text1"/>
+                <w:lang w:val="en-US"/>
+              </w:rPr>
+            </w:pPr>
+            <w:r>
+              <w:rPr>
+                <w:color w:val="000000" w:themeColor="text1"/>
+                <w:lang w:val="en-US"/>
+              </w:rPr>
+              <w:t>11</w:t>
+            </w:r>
+          </w:p>
+        </w:tc>
+        <w:tc>
+          <w:tcPr>
+            <w:tcW w:w="4777" w:type="dxa"/>
+          </w:tcPr>
+          <w:p>
+            <w:pPr>
+              <w:rPr>
+                <w:i/>
+                <w:iCs/>
+                <w:color w:val="000000" w:themeColor="text1"/>
+                <w:lang w:val="en-US"/>
+              </w:rPr>
+            </w:pPr>
+            <w:r>
+              <w:rPr>
+                <w:i/>
+                <w:iCs/>
+                <w:color w:val="000000" w:themeColor="text1"/>
+                <w:lang w:val="en-US"/>
+              </w:rPr>
+              <w:t>A Block-Level Analysis of Medical Marijuana</w:t>
+            </w:r>
+          </w:p>
+          <w:p>
+            <w:pPr>
+              <w:rPr>
+                <w:color w:val="000000" w:themeColor="text1"/>
+                <w:lang w:val="en-US"/>
+              </w:rPr>
+            </w:pPr>
+            <w:r>
+              <w:rPr>
+                <w:i/>
+                <w:iCs/>
+                <w:color w:val="000000" w:themeColor="text1"/>
+                <w:lang w:val="en-US"/>
+              </w:rPr>
+              <w:t>Dispensaries and Crime in the City of Los Angeles</w:t>
+            </w:r>
+          </w:p>
+        </w:tc>
+        <w:tc>
+          <w:tcPr>
+            <w:tcW w:w="4171" w:type="dxa"/>
+          </w:tcPr>
+          <w:p>
+            <w:pPr>
+              <w:rPr>
+                <w:color w:val="000000" w:themeColor="text1"/>
+                <w:lang w:val="en-US"/>
+              </w:rPr>
+            </w:pPr>
+          </w:p>
+        </w:tc>
+        <w:tc>
+          <w:tcPr>
+            <w:tcW w:w="4995" w:type="dxa"/>
+          </w:tcPr>
+          <w:p>
+            <w:pPr>
+              <w:rPr>
+                <w:color w:val="000000" w:themeColor="text1"/>
+                <w:lang w:val="en-US"/>
+              </w:rPr>
+            </w:pPr>
+          </w:p>
+        </w:tc>
+      </w:tr>
+      <w:tr>
+        <w:tc>
+          <w:tcPr>
+            <w:tcW w:w="658" w:type="dxa"/>
+          </w:tcPr>
+          <w:p>
+            <w:pPr>
+              <w:rPr>
+                <w:color w:val="000000" w:themeColor="text1"/>
+                <w:lang w:val="en-US"/>
+              </w:rPr>
+            </w:pPr>
+            <w:r>
+              <w:rPr>
+                <w:color w:val="000000" w:themeColor="text1"/>
+                <w:lang w:val="en-US"/>
+              </w:rPr>
+              <w:t>12</w:t>
+            </w:r>
+          </w:p>
+        </w:tc>
+        <w:tc>
+          <w:tcPr>
+            <w:tcW w:w="4777" w:type="dxa"/>
+          </w:tcPr>
+          <w:p>
+            <w:pPr>
+              <w:rPr>
+                <w:i/>
+                <w:iCs/>
+                <w:color w:val="000000" w:themeColor="text1"/>
+                <w:lang w:val="en-US"/>
+              </w:rPr>
+            </w:pPr>
+            <w:r>
+              <w:rPr>
+                <w:i/>
+                <w:iCs/>
+                <w:color w:val="000000" w:themeColor="text1"/>
+                <w:lang w:val="en-US"/>
+              </w:rPr>
+              <w:t>Aggravating effects of alcohol outlet types on</w:t>
+            </w:r>
+            <w:r>
+              <w:rPr>
+                <w:i/>
+                <w:iCs/>
+                <w:color w:val="000000" w:themeColor="text1"/>
+                <w:lang w:val="en-US"/>
+              </w:rPr>
+              <w:t xml:space="preserve"> </w:t>
+            </w:r>
+            <w:r>
+              <w:rPr>
+                <w:i/>
+                <w:iCs/>
+                <w:color w:val="000000" w:themeColor="text1"/>
+                <w:lang w:val="en-US"/>
+              </w:rPr>
+              <w:t>street robbery and aggravated assault in</w:t>
+            </w:r>
+            <w:r>
+              <w:rPr>
+                <w:i/>
+                <w:iCs/>
+                <w:color w:val="000000" w:themeColor="text1"/>
+                <w:lang w:val="en-US"/>
+              </w:rPr>
+              <w:t xml:space="preserve"> </w:t>
+            </w:r>
+            <w:r>
+              <w:rPr>
+                <w:i/>
+                <w:iCs/>
+                <w:color w:val="000000" w:themeColor="text1"/>
+                <w:lang w:val="en-US"/>
+              </w:rPr>
+              <w:t>New</w:t>
+            </w:r>
+            <w:r>
+              <w:rPr>
+                <w:i/>
+                <w:iCs/>
+                <w:color w:val="000000" w:themeColor="text1"/>
+                <w:lang w:val="en-US"/>
+              </w:rPr>
+              <w:t xml:space="preserve"> </w:t>
+            </w:r>
+            <w:r>
+              <w:rPr>
+                <w:i/>
+                <w:iCs/>
+                <w:color w:val="000000" w:themeColor="text1"/>
+                <w:lang w:val="en-US"/>
+              </w:rPr>
+              <w:t>York City</w:t>
+            </w:r>
+          </w:p>
+        </w:tc>
+        <w:tc>
+          <w:tcPr>
+            <w:tcW w:w="4171" w:type="dxa"/>
+          </w:tcPr>
+          <w:p>
+            <w:pPr>
+              <w:rPr>
+                <w:color w:val="000000" w:themeColor="text1"/>
+                <w:lang w:val="en-US"/>
+              </w:rPr>
+            </w:pPr>
+          </w:p>
+        </w:tc>
+        <w:tc>
+          <w:tcPr>
+            <w:tcW w:w="4995" w:type="dxa"/>
+          </w:tcPr>
+          <w:p>
+            <w:pPr>
+              <w:rPr>
+                <w:color w:val="000000" w:themeColor="text1"/>
+                <w:lang w:val="en-US"/>
+              </w:rPr>
+            </w:pPr>
+          </w:p>
+        </w:tc>
+      </w:tr>
+      <w:tr>
+        <w:tc>
+          <w:tcPr>
+            <w:tcW w:w="658" w:type="dxa"/>
+          </w:tcPr>
+          <w:p>
+            <w:pPr>
+              <w:rPr>
+                <w:color w:val="000000" w:themeColor="text1"/>
+                <w:lang w:val="en-US"/>
+              </w:rPr>
+            </w:pPr>
+            <w:r>
+              <w:rPr>
+                <w:color w:val="000000" w:themeColor="text1"/>
+                <w:lang w:val="en-US"/>
+              </w:rPr>
+              <w:t>13</w:t>
+            </w:r>
+          </w:p>
+        </w:tc>
+        <w:tc>
+          <w:tcPr>
+            <w:tcW w:w="4777" w:type="dxa"/>
+          </w:tcPr>
+          <w:p>
+            <w:pPr>
+              <w:rPr>
+                <w:i/>
+                <w:iCs/>
+                <w:strike/>
+                <w:color w:val="000000" w:themeColor="text1"/>
+                <w:lang w:val="en-US"/>
+              </w:rPr>
+            </w:pPr>
+            <w:r>
+              <w:rPr>
+                <w:i/>
+                <w:iCs/>
+                <w:strike/>
+                <w:color w:val="000000" w:themeColor="text1"/>
+                <w:lang w:val="en-US"/>
+              </w:rPr>
+              <w:t>When Crime Moves</w:t>
+            </w:r>
+            <w:r>
+              <w:rPr>
+                <w:i/>
+                <w:iCs/>
+                <w:strike/>
+                <w:color w:val="000000" w:themeColor="text1"/>
+                <w:lang w:val="en-US"/>
+              </w:rPr>
+              <w:t xml:space="preserve"> </w:t>
+            </w:r>
+            <w:r>
+              <w:rPr>
+                <w:i/>
+                <w:iCs/>
+                <w:strike/>
+                <w:color w:val="000000" w:themeColor="text1"/>
+                <w:lang w:val="en-US"/>
+              </w:rPr>
+              <w:t>Where Does It Go?</w:t>
+            </w:r>
+            <w:r>
+              <w:rPr>
+                <w:i/>
+                <w:iCs/>
+                <w:strike/>
+                <w:color w:val="000000" w:themeColor="text1"/>
+                <w:lang w:val="en-US"/>
+              </w:rPr>
+              <w:t xml:space="preserve"> </w:t>
+            </w:r>
+            <w:r>
+              <w:rPr>
+                <w:i/>
+                <w:iCs/>
+                <w:strike/>
+                <w:color w:val="000000" w:themeColor="text1"/>
+                <w:lang w:val="en-US"/>
+              </w:rPr>
+              <w:t>Analyzing the Spatial</w:t>
+            </w:r>
+            <w:r>
+              <w:rPr>
+                <w:i/>
+                <w:iCs/>
+                <w:strike/>
+                <w:color w:val="000000" w:themeColor="text1"/>
+                <w:lang w:val="en-US"/>
+              </w:rPr>
+              <w:t xml:space="preserve"> </w:t>
+            </w:r>
+            <w:r>
+              <w:rPr>
+                <w:i/>
+                <w:iCs/>
+                <w:strike/>
+                <w:color w:val="000000" w:themeColor="text1"/>
+                <w:lang w:val="en-US"/>
+              </w:rPr>
+              <w:t>Correlates of Robbery</w:t>
+            </w:r>
+            <w:r>
+              <w:rPr>
+                <w:i/>
+                <w:iCs/>
+                <w:strike/>
+                <w:color w:val="000000" w:themeColor="text1"/>
+                <w:lang w:val="en-US"/>
+              </w:rPr>
+              <w:t xml:space="preserve"> </w:t>
+            </w:r>
+            <w:r>
+              <w:rPr>
+                <w:i/>
+                <w:iCs/>
+                <w:strike/>
+                <w:color w:val="000000" w:themeColor="text1"/>
+                <w:lang w:val="en-US"/>
+              </w:rPr>
+              <w:t>Incidents Displaced by</w:t>
+            </w:r>
+            <w:r>
+              <w:rPr>
+                <w:i/>
+                <w:iCs/>
+                <w:strike/>
+                <w:color w:val="000000" w:themeColor="text1"/>
+                <w:lang w:val="en-US"/>
+              </w:rPr>
+              <w:t xml:space="preserve"> </w:t>
+            </w:r>
+            <w:r>
+              <w:rPr>
+                <w:i/>
+                <w:iCs/>
+                <w:strike/>
+                <w:color w:val="000000" w:themeColor="text1"/>
+                <w:lang w:val="en-US"/>
+              </w:rPr>
+              <w:t>a Place-based Policin</w:t>
+            </w:r>
+            <w:r>
+              <w:rPr>
+                <w:i/>
+                <w:iCs/>
+                <w:strike/>
+                <w:color w:val="000000" w:themeColor="text1"/>
+                <w:lang w:val="en-US"/>
+              </w:rPr>
+              <w:t xml:space="preserve">g </w:t>
+            </w:r>
+            <w:r>
+              <w:rPr>
+                <w:i/>
+                <w:iCs/>
+                <w:strike/>
+                <w:color w:val="000000" w:themeColor="text1"/>
+                <w:lang w:val="en-US"/>
+              </w:rPr>
+              <w:t>Intervention</w:t>
+            </w:r>
+          </w:p>
+        </w:tc>
+        <w:tc>
+          <w:tcPr>
+            <w:tcW w:w="4171" w:type="dxa"/>
+          </w:tcPr>
+          <w:p>
+            <w:pPr>
+              <w:rPr>
+                <w:color w:val="000000" w:themeColor="text1"/>
+                <w:lang w:val="en-US"/>
+              </w:rPr>
+            </w:pPr>
+          </w:p>
+        </w:tc>
+        <w:tc>
+          <w:tcPr>
+            <w:tcW w:w="4995" w:type="dxa"/>
+          </w:tcPr>
+          <w:p>
+            <w:pPr>
+              <w:rPr>
+                <w:color w:val="000000" w:themeColor="text1"/>
+                <w:lang w:val="en-US"/>
+              </w:rPr>
+            </w:pPr>
+          </w:p>
+        </w:tc>
+      </w:tr>
+      <w:tr>
+        <w:tc>
+          <w:tcPr>
+            <w:tcW w:w="658" w:type="dxa"/>
+          </w:tcPr>
+          <w:p>
+            <w:pPr>
+              <w:rPr>
+                <w:color w:val="000000" w:themeColor="text1"/>
+                <w:lang w:val="en-US"/>
+              </w:rPr>
+            </w:pPr>
+            <w:r>
+              <w:rPr>
+                <w:color w:val="000000" w:themeColor="text1"/>
+                <w:lang w:val="en-US"/>
+              </w:rPr>
+              <w:t>14</w:t>
+            </w:r>
+          </w:p>
+        </w:tc>
+        <w:tc>
+          <w:tcPr>
+            <w:tcW w:w="4777" w:type="dxa"/>
+          </w:tcPr>
+          <w:p>
+            <w:pPr>
+              <w:rPr>
+                <w:strike/>
+                <w:color w:val="000000" w:themeColor="text1"/>
+                <w:lang w:val="en-US"/>
+              </w:rPr>
+            </w:pPr>
+            <w:r>
+              <w:rPr>
+                <w:i/>
+                <w:iCs/>
+                <w:strike/>
+                <w:color w:val="000000" w:themeColor="text1"/>
+                <w:lang w:val="en-US"/>
+              </w:rPr>
+              <w:t>Crime-time: how ambient light affects crime</w:t>
+            </w:r>
+          </w:p>
+        </w:tc>
+        <w:tc>
+          <w:tcPr>
+            <w:tcW w:w="4171" w:type="dxa"/>
+          </w:tcPr>
+          <w:p>
+            <w:pPr>
+              <w:rPr>
+                <w:color w:val="000000" w:themeColor="text1"/>
+                <w:lang w:val="en-US"/>
+              </w:rPr>
+            </w:pPr>
+          </w:p>
+        </w:tc>
+        <w:tc>
+          <w:tcPr>
+            <w:tcW w:w="4995" w:type="dxa"/>
+          </w:tcPr>
+          <w:p>
+            <w:pPr>
+              <w:rPr>
+                <w:color w:val="000000" w:themeColor="text1"/>
+                <w:lang w:val="en-US"/>
               </w:rPr>
             </w:pPr>
           </w:p>
@@ -396,7 +1738,8 @@
     <w:p>
       <w:pPr>
         <w:rPr>
-          <w:lang w:val="es-ES_tradnl"/>
+          <w:color w:val="000000" w:themeColor="text1"/>
+          <w:lang w:val="en-US"/>
         </w:rPr>
       </w:pPr>
     </w:p>

</xml_diff>